<commit_message>
Remove employer signature line from termination letter template
The letter ended with an employer "בברכה, ____" sign-off block below
the employee's own acknowledgment line, but that block has no field
tokens and isn't filled by the app -- it's just dead signature space
that isn't needed. Removed it; the employee acknowledgment line (with
its SMS-signature marker) is unchanged.

Co-Authored-By: Claude Sonnet 5 <noreply@anthropic.com>
Claude-Session: https://claude.ai/code/session_017YBdbLgA5r26WVeb5ZLVqU
</commit_message>
<xml_diff>
--- a/template_piturim.docx
+++ b/template_piturim.docx
@@ -418,34 +418,6 @@
       </w:r>
     </w:p>
     <w:p/>
-    <w:p>
-      <w:pPr>
-        <w:rPr>
-          <w:rtl/>
-        </w:rPr>
-      </w:pPr>
-      <w:r>
-        <w:rPr>
-          <w:rFonts w:hint="cs"/>
-          <w:rtl/>
-        </w:rPr>
-        <w:t>בברכה,</w:t>
-      </w:r>
-    </w:p>
-    <w:p>
-      <w:pPr>
-        <w:rPr>
-          <w:rtl/>
-        </w:rPr>
-      </w:pPr>
-      <w:r>
-        <w:rPr>
-          <w:rFonts w:hint="cs"/>
-          <w:rtl/>
-        </w:rPr>
-        <w:t>_________</w:t>
-      </w:r>
-    </w:p>
     <w:p>
       <w:pPr>
         <w:rPr>

</xml_diff>

<commit_message>
Remove employee acknowledgment/signature line from termination letter
The letter required the employee to sign confirming they'd read it
("אישור העובד: קראתי וקיבלתי את המכתב ____"), which isn't wanted. That
line also carried the invisible marker the SMS digital-signature feature
used to place the signature field, so "termination" is dropped from
SMS_SIGNABLE_DOC_TYPES (backend and frontend) since there's nothing left
to sign.

Co-Authored-By: Claude Sonnet 5 <noreply@anthropic.com>
Claude-Session: https://claude.ai/code/session_017YBdbLgA5r26WVeb5ZLVqU
</commit_message>
<xml_diff>
--- a/template_piturim.docx
+++ b/template_piturim.docx
@@ -396,26 +396,6 @@
           <w:rtl/>
         </w:rPr>
       </w:pPr>
-    </w:p>
-    <w:p>
-      <w:pPr>
-        <w:bidi/>
-      </w:pPr>
-      <w:r>
-        <w:rPr>
-          <w:rtl/>
-        </w:rPr>
-        <w:t>אישור העובד: קראתי וקיבלתי את המכתב ____________</w:t>
-      </w:r>
-      <w:r>
-        <w:rPr>
-          <w:color w:val="FFFFFF"/>
-          <w:sz w:val="48"/>
-          <w:position w:val="-20"/>
-          <w:rtl/>
-        </w:rPr>
-        <w:t>§§§§§§</w:t>
-      </w:r>
     </w:p>
     <w:p/>
     <w:p>

</xml_diff>